<commit_message>
Prepare user guide template for updates
</commit_message>
<xml_diff>
--- a/assets/user-guide/V4 User Guide Template.docx
+++ b/assets/user-guide/V4 User Guide Template.docx
@@ -3067,6 +3067,14 @@
         <w:t>End of example guide. Review this document against the target V4 deployment before issuing it as an official manual.</w:t>
       </w:r>
     </w:p>
+    <w:p>
+      <w:r>
+        <w:rPr>
+          <w:vanish/>
+        </w:rPr>
+        <w:t>[[AUTO_GUIDE_CONTENT]]</w:t>
+      </w:r>
+    </w:p>
     <w:sectPr>
       <w:footerReference w:type="default" r:id="rId9"/>
       <w:pgSz w:w="11909" w:h="16834"/>

</xml_diff>